<commit_message>
This is structural and internal change
</commit_message>
<xml_diff>
--- a/Desktop/CS data/Primary  Hospital.docx
+++ b/Desktop/CS data/Primary  Hospital.docx
@@ -43,7 +43,7 @@
     </w:p>
     <w:p>
       <w:pPr>
-        <w:spacing w:after="0" w:line="240" w:lineRule="auto"/>
+        <w:spacing w:line="240" w:lineRule="auto"/>
         <w:jc w:val="center"/>
         <w:rPr>
           <w:rFonts w:ascii="Power Geez Unicode1" w:eastAsia="Times New Roman" w:hAnsi="Power Geez Unicode1"/>
@@ -76,8 +76,10 @@
           <w:szCs w:val="24"/>
           <w:lang w:val="am-ET"/>
         </w:rPr>
-        <w:t>ደ/ኤሊያስ</w:t>
+        <w:t>ቢቸና</w:t>
       </w:r>
+      <w:bookmarkStart w:id="0" w:name="_GoBack"/>
+      <w:bookmarkEnd w:id="0"/>
       <w:r>
         <w:rPr>
           <w:rFonts w:ascii="Nyala" w:eastAsia="Times New Roman" w:hAnsi="Nyala"/>
@@ -122,10 +124,10 @@
       </w:tblPr>
       <w:tblGrid>
         <w:gridCol w:w="576"/>
-        <w:gridCol w:w="1651"/>
-        <w:gridCol w:w="2294"/>
-        <w:gridCol w:w="1838"/>
-        <w:gridCol w:w="756"/>
+        <w:gridCol w:w="2561"/>
+        <w:gridCol w:w="9292"/>
+        <w:gridCol w:w="1733"/>
+        <w:gridCol w:w="838"/>
         <w:gridCol w:w="925"/>
       </w:tblGrid>
       <w:tr>
@@ -350,23 +352,20 @@
               <w:bottom w:val="single" w:sz="4" w:space="0" w:color="000000"/>
               <w:right w:val="single" w:sz="4" w:space="0" w:color="000000"/>
             </w:tcBorders>
-            <w:vAlign w:val="bottom"/>
-          </w:tcPr>
-          <w:p>
-            <w:pPr>
-              <w:jc w:val="right"/>
-              <w:rPr>
-                <w:rFonts w:cs="Calibri"/>
-                <w:color w:val="000000"/>
-                <w:sz w:val="24"/>
-                <w:szCs w:val="24"/>
-              </w:rPr>
-            </w:pPr>
-            <w:bookmarkStart w:id="0" w:name="_GoBack" w:colFirst="4" w:colLast="4"/>
+          </w:tcPr>
+          <w:p>
+            <w:pPr>
+              <w:rPr>
+                <w:rFonts w:ascii="Power Geez Unicode3" w:hAnsi="Power Geez Unicode3"/>
+                <w:sz w:val="28"/>
+                <w:szCs w:val="28"/>
+              </w:rPr>
+            </w:pPr>
             <w:r>
               <w:rPr>
-                <w:rFonts w:cs="Calibri"/>
-                <w:color w:val="000000"/>
+                <w:rFonts w:ascii="Power Geez Unicode3" w:hAnsi="Power Geez Unicode3"/>
+                <w:sz w:val="28"/>
+                <w:szCs w:val="28"/>
               </w:rPr>
               <w:t>1</w:t>
             </w:r>
@@ -381,24 +380,22 @@
               <w:bottom w:val="single" w:sz="4" w:space="0" w:color="000000"/>
               <w:right w:val="single" w:sz="4" w:space="0" w:color="000000"/>
             </w:tcBorders>
-            <w:vAlign w:val="center"/>
-          </w:tcPr>
-          <w:p>
-            <w:pPr>
-              <w:jc w:val="both"/>
-              <w:rPr>
-                <w:rFonts w:ascii="Power Geez Unicode1" w:hAnsi="Power Geez Unicode1" w:cs="Calibri"/>
-                <w:color w:val="000000"/>
-                <w:sz w:val="24"/>
-                <w:szCs w:val="24"/>
+          </w:tcPr>
+          <w:p>
+            <w:pPr>
+              <w:rPr>
+                <w:rFonts w:ascii="Power Geez Unicode3" w:hAnsi="Power Geez Unicode3"/>
+                <w:sz w:val="28"/>
+                <w:szCs w:val="28"/>
               </w:rPr>
             </w:pPr>
             <w:r>
               <w:rPr>
-                <w:rFonts w:ascii="Power Geez Unicode1" w:hAnsi="Power Geez Unicode1" w:cs="Calibri"/>
-                <w:color w:val="000000"/>
-              </w:rPr>
-              <w:t>ይበይን ከፌ</w:t>
+                <w:rFonts w:ascii="Power Geez Unicode3" w:hAnsi="Power Geez Unicode3"/>
+                <w:sz w:val="28"/>
+                <w:szCs w:val="28"/>
+              </w:rPr>
+              <w:t xml:space="preserve">ዳምጤ ጌቴ ታሪኩ </w:t>
             </w:r>
           </w:p>
         </w:tc>
@@ -411,24 +408,22 @@
               <w:bottom w:val="single" w:sz="4" w:space="0" w:color="000000"/>
               <w:right w:val="single" w:sz="4" w:space="0" w:color="000000"/>
             </w:tcBorders>
-            <w:vAlign w:val="center"/>
-          </w:tcPr>
-          <w:p>
-            <w:pPr>
-              <w:jc w:val="both"/>
-              <w:rPr>
-                <w:rFonts w:ascii="Power Geez Unicode1" w:hAnsi="Power Geez Unicode1" w:cs="Calibri"/>
-                <w:color w:val="000000"/>
-                <w:sz w:val="24"/>
-                <w:szCs w:val="24"/>
+          </w:tcPr>
+          <w:p>
+            <w:pPr>
+              <w:rPr>
+                <w:rFonts w:ascii="Power Geez Unicode3" w:hAnsi="Power Geez Unicode3"/>
+                <w:sz w:val="28"/>
+                <w:szCs w:val="28"/>
               </w:rPr>
             </w:pPr>
             <w:r>
               <w:rPr>
-                <w:rFonts w:ascii="Power Geez Unicode1" w:hAnsi="Power Geez Unicode1" w:cs="Calibri"/>
-                <w:color w:val="000000"/>
-              </w:rPr>
-              <w:t xml:space="preserve">ደረጃ 5 አንስቴቲስት </w:t>
+                <w:rFonts w:ascii="Power Geez Unicode3" w:hAnsi="Power Geez Unicode3"/>
+                <w:sz w:val="28"/>
+                <w:szCs w:val="28"/>
+              </w:rPr>
+              <w:t>የተቀናጀ የድንገተኛ ቀዶ ህክምና (የማህፀንና ፅንስ ህክምናና አጠቃላይ ቀዶ ህክምና) ፕሮፌሽናል ስፔሻሊስት</w:t>
             </w:r>
           </w:p>
         </w:tc>
@@ -453,51 +448,33 @@
                 <w:lang w:val="am-ET"/>
               </w:rPr>
             </w:pPr>
+          </w:p>
+        </w:tc>
+        <w:tc>
+          <w:tcPr>
+            <w:tcW w:w="0" w:type="auto"/>
+            <w:tcBorders>
+              <w:top w:val="single" w:sz="4" w:space="0" w:color="000000"/>
+              <w:left w:val="single" w:sz="4" w:space="0" w:color="000000"/>
+              <w:bottom w:val="single" w:sz="4" w:space="0" w:color="000000"/>
+              <w:right w:val="single" w:sz="4" w:space="0" w:color="auto"/>
+            </w:tcBorders>
+          </w:tcPr>
+          <w:p>
+            <w:pPr>
+              <w:rPr>
+                <w:rFonts w:ascii="Power Geez Unicode3" w:hAnsi="Power Geez Unicode3"/>
+                <w:sz w:val="28"/>
+                <w:szCs w:val="28"/>
+              </w:rPr>
+            </w:pPr>
             <w:r>
               <w:rPr>
-                <w:rFonts w:ascii="Power Geez Unicode1" w:eastAsia="Times New Roman" w:hAnsi="Power Geez Unicode1"/>
-                <w:sz w:val="20"/>
-                <w:szCs w:val="20"/>
-              </w:rPr>
-              <w:t>13.6</w:t>
-            </w:r>
-            <w:r>
-              <w:rPr>
-                <w:rFonts w:ascii="Power Geez Unicode1" w:eastAsia="Times New Roman" w:hAnsi="Power Geez Unicode1"/>
-                <w:sz w:val="20"/>
-                <w:szCs w:val="20"/>
-              </w:rPr>
-              <w:t>/አዲ-አ/ሆሰ--</w:t>
-            </w:r>
-          </w:p>
-        </w:tc>
-        <w:tc>
-          <w:tcPr>
-            <w:tcW w:w="0" w:type="auto"/>
-            <w:tcBorders>
-              <w:top w:val="single" w:sz="4" w:space="0" w:color="000000"/>
-              <w:left w:val="single" w:sz="4" w:space="0" w:color="000000"/>
-              <w:bottom w:val="single" w:sz="4" w:space="0" w:color="000000"/>
-              <w:right w:val="single" w:sz="4" w:space="0" w:color="auto"/>
-            </w:tcBorders>
-            <w:vAlign w:val="center"/>
-          </w:tcPr>
-          <w:p>
-            <w:pPr>
-              <w:jc w:val="both"/>
-              <w:rPr>
-                <w:rFonts w:ascii="Power Geez Unicode1" w:hAnsi="Power Geez Unicode1" w:cs="Calibri"/>
-                <w:color w:val="000000"/>
-                <w:sz w:val="24"/>
-                <w:szCs w:val="24"/>
-              </w:rPr>
-            </w:pPr>
-            <w:r>
-              <w:rPr>
-                <w:rFonts w:ascii="Power Geez Unicode1" w:hAnsi="Power Geez Unicode1" w:cs="Calibri"/>
-                <w:color w:val="000000"/>
-              </w:rPr>
-              <w:t xml:space="preserve">ካሪየር </w:t>
+                <w:rFonts w:ascii="Power Geez Unicode3" w:hAnsi="Power Geez Unicode3"/>
+                <w:sz w:val="28"/>
+                <w:szCs w:val="28"/>
+              </w:rPr>
+              <w:t>XVIII</w:t>
             </w:r>
           </w:p>
         </w:tc>
@@ -539,22 +516,20 @@
               <w:bottom w:val="single" w:sz="4" w:space="0" w:color="000000"/>
               <w:right w:val="single" w:sz="4" w:space="0" w:color="000000"/>
             </w:tcBorders>
-            <w:vAlign w:val="bottom"/>
-          </w:tcPr>
-          <w:p>
-            <w:pPr>
-              <w:jc w:val="right"/>
-              <w:rPr>
-                <w:rFonts w:cs="Calibri"/>
-                <w:color w:val="000000"/>
-                <w:sz w:val="24"/>
-                <w:szCs w:val="24"/>
+          </w:tcPr>
+          <w:p>
+            <w:pPr>
+              <w:rPr>
+                <w:rFonts w:ascii="Power Geez Unicode3" w:hAnsi="Power Geez Unicode3"/>
+                <w:sz w:val="28"/>
+                <w:szCs w:val="28"/>
               </w:rPr>
             </w:pPr>
             <w:r>
               <w:rPr>
-                <w:rFonts w:cs="Calibri"/>
-                <w:color w:val="000000"/>
+                <w:rFonts w:ascii="Power Geez Unicode3" w:hAnsi="Power Geez Unicode3"/>
+                <w:sz w:val="28"/>
+                <w:szCs w:val="28"/>
               </w:rPr>
               <w:t>2</w:t>
             </w:r>
@@ -569,24 +544,22 @@
               <w:bottom w:val="single" w:sz="4" w:space="0" w:color="000000"/>
               <w:right w:val="single" w:sz="4" w:space="0" w:color="000000"/>
             </w:tcBorders>
-            <w:vAlign w:val="center"/>
-          </w:tcPr>
-          <w:p>
-            <w:pPr>
-              <w:jc w:val="both"/>
-              <w:rPr>
-                <w:rFonts w:ascii="Power Geez Unicode1" w:hAnsi="Power Geez Unicode1" w:cs="Calibri"/>
-                <w:color w:val="000000"/>
-                <w:sz w:val="24"/>
-                <w:szCs w:val="24"/>
+          </w:tcPr>
+          <w:p>
+            <w:pPr>
+              <w:rPr>
+                <w:rFonts w:ascii="Power Geez Unicode3" w:hAnsi="Power Geez Unicode3"/>
+                <w:sz w:val="28"/>
+                <w:szCs w:val="28"/>
               </w:rPr>
             </w:pPr>
             <w:r>
               <w:rPr>
-                <w:rFonts w:ascii="Power Geez Unicode1" w:hAnsi="Power Geez Unicode1" w:cs="Calibri"/>
-                <w:color w:val="000000"/>
-              </w:rPr>
-              <w:t xml:space="preserve">ሰፊነህ ደሴ </w:t>
+                <w:rFonts w:ascii="Power Geez Unicode3" w:hAnsi="Power Geez Unicode3"/>
+                <w:sz w:val="28"/>
+                <w:szCs w:val="28"/>
+              </w:rPr>
+              <w:t xml:space="preserve">አብርሃም ወልደገሪማ በርሄ </w:t>
             </w:r>
           </w:p>
         </w:tc>
@@ -599,24 +572,22 @@
               <w:bottom w:val="single" w:sz="4" w:space="0" w:color="000000"/>
               <w:right w:val="single" w:sz="4" w:space="0" w:color="000000"/>
             </w:tcBorders>
-            <w:vAlign w:val="center"/>
-          </w:tcPr>
-          <w:p>
-            <w:pPr>
-              <w:jc w:val="both"/>
-              <w:rPr>
-                <w:rFonts w:ascii="Power Geez Unicode1" w:hAnsi="Power Geez Unicode1" w:cs="Calibri"/>
-                <w:color w:val="000000"/>
-                <w:sz w:val="24"/>
-                <w:szCs w:val="24"/>
+          </w:tcPr>
+          <w:p>
+            <w:pPr>
+              <w:rPr>
+                <w:rFonts w:ascii="Power Geez Unicode3" w:hAnsi="Power Geez Unicode3"/>
+                <w:sz w:val="28"/>
+                <w:szCs w:val="28"/>
               </w:rPr>
             </w:pPr>
             <w:r>
               <w:rPr>
-                <w:rFonts w:ascii="Power Geez Unicode1" w:hAnsi="Power Geez Unicode1" w:cs="Calibri"/>
-                <w:color w:val="000000"/>
-              </w:rPr>
-              <w:t>ሳይካትሪ ኘሮፊሽናል</w:t>
+                <w:rFonts w:ascii="Power Geez Unicode3" w:hAnsi="Power Geez Unicode3"/>
+                <w:sz w:val="28"/>
+                <w:szCs w:val="28"/>
+              </w:rPr>
+              <w:t>የተቀናጀ የድንገተኛ ቀዶ ህክምና (የማህፀንና ፅንስ ህክምናና አጠቃላይ ቀዶ ህክምና) ፕሮፌሽናል ስፔሻሊስት</w:t>
             </w:r>
           </w:p>
         </w:tc>
@@ -641,51 +612,33 @@
                 <w:lang w:val="am-ET"/>
               </w:rPr>
             </w:pPr>
+          </w:p>
+        </w:tc>
+        <w:tc>
+          <w:tcPr>
+            <w:tcW w:w="0" w:type="auto"/>
+            <w:tcBorders>
+              <w:top w:val="single" w:sz="4" w:space="0" w:color="000000"/>
+              <w:left w:val="single" w:sz="4" w:space="0" w:color="000000"/>
+              <w:bottom w:val="single" w:sz="4" w:space="0" w:color="000000"/>
+              <w:right w:val="single" w:sz="4" w:space="0" w:color="auto"/>
+            </w:tcBorders>
+          </w:tcPr>
+          <w:p>
+            <w:pPr>
+              <w:rPr>
+                <w:rFonts w:ascii="Power Geez Unicode3" w:hAnsi="Power Geez Unicode3"/>
+                <w:sz w:val="28"/>
+                <w:szCs w:val="28"/>
+              </w:rPr>
+            </w:pPr>
             <w:r>
               <w:rPr>
-                <w:rFonts w:ascii="Power Geez Unicode1" w:eastAsia="Times New Roman" w:hAnsi="Power Geez Unicode1"/>
-                <w:sz w:val="20"/>
-                <w:szCs w:val="20"/>
-              </w:rPr>
-              <w:t>13.6</w:t>
-            </w:r>
-            <w:r>
-              <w:rPr>
-                <w:rFonts w:ascii="Power Geez Unicode1" w:eastAsia="Times New Roman" w:hAnsi="Power Geez Unicode1"/>
-                <w:sz w:val="20"/>
-                <w:szCs w:val="20"/>
-              </w:rPr>
-              <w:t>/አዲ-አ/ሆሰ--</w:t>
-            </w:r>
-          </w:p>
-        </w:tc>
-        <w:tc>
-          <w:tcPr>
-            <w:tcW w:w="0" w:type="auto"/>
-            <w:tcBorders>
-              <w:top w:val="single" w:sz="4" w:space="0" w:color="000000"/>
-              <w:left w:val="single" w:sz="4" w:space="0" w:color="000000"/>
-              <w:bottom w:val="single" w:sz="4" w:space="0" w:color="000000"/>
-              <w:right w:val="single" w:sz="4" w:space="0" w:color="auto"/>
-            </w:tcBorders>
-            <w:vAlign w:val="center"/>
-          </w:tcPr>
-          <w:p>
-            <w:pPr>
-              <w:jc w:val="both"/>
-              <w:rPr>
-                <w:rFonts w:ascii="Power Geez Unicode1" w:hAnsi="Power Geez Unicode1" w:cs="Calibri"/>
-                <w:color w:val="000000"/>
-                <w:sz w:val="24"/>
-                <w:szCs w:val="24"/>
-              </w:rPr>
-            </w:pPr>
-            <w:r>
-              <w:rPr>
-                <w:rFonts w:ascii="Power Geez Unicode1" w:hAnsi="Power Geez Unicode1" w:cs="Calibri"/>
-                <w:color w:val="000000"/>
-              </w:rPr>
-              <w:t xml:space="preserve">ካሪየር </w:t>
+                <w:rFonts w:ascii="Power Geez Unicode3" w:hAnsi="Power Geez Unicode3"/>
+                <w:sz w:val="28"/>
+                <w:szCs w:val="28"/>
+              </w:rPr>
+              <w:t>XVIII</w:t>
             </w:r>
           </w:p>
         </w:tc>
@@ -727,22 +680,20 @@
               <w:bottom w:val="single" w:sz="4" w:space="0" w:color="000000"/>
               <w:right w:val="single" w:sz="4" w:space="0" w:color="000000"/>
             </w:tcBorders>
-            <w:vAlign w:val="bottom"/>
-          </w:tcPr>
-          <w:p>
-            <w:pPr>
-              <w:jc w:val="right"/>
-              <w:rPr>
-                <w:rFonts w:cs="Calibri"/>
-                <w:color w:val="000000"/>
-                <w:sz w:val="24"/>
-                <w:szCs w:val="24"/>
+          </w:tcPr>
+          <w:p>
+            <w:pPr>
+              <w:rPr>
+                <w:rFonts w:ascii="Power Geez Unicode3" w:hAnsi="Power Geez Unicode3"/>
+                <w:sz w:val="28"/>
+                <w:szCs w:val="28"/>
               </w:rPr>
             </w:pPr>
             <w:r>
               <w:rPr>
-                <w:rFonts w:cs="Calibri"/>
-                <w:color w:val="000000"/>
+                <w:rFonts w:ascii="Power Geez Unicode3" w:hAnsi="Power Geez Unicode3"/>
+                <w:sz w:val="28"/>
+                <w:szCs w:val="28"/>
               </w:rPr>
               <w:t>3</w:t>
             </w:r>
@@ -757,24 +708,22 @@
               <w:bottom w:val="single" w:sz="4" w:space="0" w:color="000000"/>
               <w:right w:val="single" w:sz="4" w:space="0" w:color="000000"/>
             </w:tcBorders>
-            <w:vAlign w:val="center"/>
-          </w:tcPr>
-          <w:p>
-            <w:pPr>
-              <w:jc w:val="both"/>
-              <w:rPr>
-                <w:rFonts w:ascii="Power Geez Unicode1" w:hAnsi="Power Geez Unicode1" w:cs="Calibri"/>
-                <w:color w:val="000000"/>
-                <w:sz w:val="24"/>
-                <w:szCs w:val="24"/>
+          </w:tcPr>
+          <w:p>
+            <w:pPr>
+              <w:rPr>
+                <w:rFonts w:ascii="Power Geez Unicode3" w:hAnsi="Power Geez Unicode3"/>
+                <w:sz w:val="28"/>
+                <w:szCs w:val="28"/>
               </w:rPr>
             </w:pPr>
             <w:r>
               <w:rPr>
-                <w:rFonts w:ascii="Power Geez Unicode1" w:hAnsi="Power Geez Unicode1" w:cs="Calibri"/>
-                <w:color w:val="000000"/>
-              </w:rPr>
-              <w:t>አያሌው ጌትነት</w:t>
+                <w:rFonts w:ascii="Power Geez Unicode3" w:hAnsi="Power Geez Unicode3"/>
+                <w:sz w:val="28"/>
+                <w:szCs w:val="28"/>
+              </w:rPr>
+              <w:t>መለሰ ተስፋ ወረቀት</w:t>
             </w:r>
           </w:p>
         </w:tc>
@@ -788,24 +737,39 @@
               <w:right w:val="single" w:sz="4" w:space="0" w:color="000000"/>
             </w:tcBorders>
             <w:shd w:val="clear" w:color="auto" w:fill="FFFFFF" w:themeFill="background1"/>
-            <w:vAlign w:val="center"/>
-          </w:tcPr>
-          <w:p>
-            <w:pPr>
-              <w:jc w:val="both"/>
-              <w:rPr>
-                <w:rFonts w:ascii="Power Geez Unicode1" w:hAnsi="Power Geez Unicode1" w:cs="Calibri"/>
-                <w:color w:val="000000"/>
-                <w:sz w:val="24"/>
-                <w:szCs w:val="24"/>
+          </w:tcPr>
+          <w:p>
+            <w:pPr>
+              <w:rPr>
+                <w:rFonts w:ascii="Power Geez Unicode3" w:hAnsi="Power Geez Unicode3"/>
+                <w:sz w:val="28"/>
+                <w:szCs w:val="28"/>
               </w:rPr>
             </w:pPr>
             <w:r>
               <w:rPr>
-                <w:rFonts w:ascii="Power Geez Unicode1" w:hAnsi="Power Geez Unicode1" w:cs="Calibri"/>
-                <w:color w:val="000000"/>
-              </w:rPr>
-              <w:t>የሰ/ኃ/አስ/ባለሙያ</w:t>
+                <w:rFonts w:ascii="Power Geez Unicode3" w:hAnsi="Power Geez Unicode3"/>
+                <w:sz w:val="28"/>
+                <w:szCs w:val="28"/>
+              </w:rPr>
+              <w:t>የእናቶችና ስነ-ተዋልዶ ጤና ነርስ ፕሮፌሽናል ስፔሻሊስት</w:t>
+            </w:r>
+          </w:p>
+          <w:p>
+            <w:pPr>
+              <w:rPr>
+                <w:rFonts w:ascii="Power Geez Unicode3" w:hAnsi="Power Geez Unicode3"/>
+                <w:sz w:val="28"/>
+                <w:szCs w:val="28"/>
+              </w:rPr>
+            </w:pPr>
+            <w:r>
+              <w:rPr>
+                <w:rFonts w:ascii="Power Geez Unicode3" w:hAnsi="Power Geez Unicode3"/>
+                <w:sz w:val="28"/>
+                <w:szCs w:val="28"/>
+              </w:rPr>
+              <w:t>(maternity &amp; reproductive health nursing profasional specialist)</w:t>
             </w:r>
           </w:p>
         </w:tc>
@@ -830,51 +794,33 @@
                 <w:lang w:val="am-ET"/>
               </w:rPr>
             </w:pPr>
+          </w:p>
+        </w:tc>
+        <w:tc>
+          <w:tcPr>
+            <w:tcW w:w="0" w:type="auto"/>
+            <w:tcBorders>
+              <w:top w:val="single" w:sz="4" w:space="0" w:color="000000"/>
+              <w:left w:val="single" w:sz="4" w:space="0" w:color="000000"/>
+              <w:bottom w:val="single" w:sz="4" w:space="0" w:color="000000"/>
+              <w:right w:val="single" w:sz="4" w:space="0" w:color="auto"/>
+            </w:tcBorders>
+          </w:tcPr>
+          <w:p>
+            <w:pPr>
+              <w:rPr>
+                <w:rFonts w:ascii="Power Geez Unicode3" w:hAnsi="Power Geez Unicode3"/>
+                <w:sz w:val="28"/>
+                <w:szCs w:val="28"/>
+              </w:rPr>
+            </w:pPr>
             <w:r>
               <w:rPr>
-                <w:rFonts w:ascii="Power Geez Unicode1" w:eastAsia="Times New Roman" w:hAnsi="Power Geez Unicode1"/>
-                <w:sz w:val="20"/>
-                <w:szCs w:val="20"/>
-              </w:rPr>
-              <w:t>13.6</w:t>
-            </w:r>
-            <w:r>
-              <w:rPr>
-                <w:rFonts w:ascii="Power Geez Unicode1" w:eastAsia="Times New Roman" w:hAnsi="Power Geez Unicode1"/>
-                <w:sz w:val="20"/>
-                <w:szCs w:val="20"/>
-              </w:rPr>
-              <w:t>/አዲ-አ/ሆሰ--</w:t>
-            </w:r>
-          </w:p>
-        </w:tc>
-        <w:tc>
-          <w:tcPr>
-            <w:tcW w:w="0" w:type="auto"/>
-            <w:tcBorders>
-              <w:top w:val="single" w:sz="4" w:space="0" w:color="000000"/>
-              <w:left w:val="single" w:sz="4" w:space="0" w:color="000000"/>
-              <w:bottom w:val="single" w:sz="4" w:space="0" w:color="000000"/>
-              <w:right w:val="single" w:sz="4" w:space="0" w:color="auto"/>
-            </w:tcBorders>
-            <w:vAlign w:val="center"/>
-          </w:tcPr>
-          <w:p>
-            <w:pPr>
-              <w:jc w:val="both"/>
-              <w:rPr>
-                <w:rFonts w:ascii="Power Geez Unicode1" w:hAnsi="Power Geez Unicode1" w:cs="Calibri"/>
-                <w:color w:val="000000"/>
-                <w:sz w:val="24"/>
-                <w:szCs w:val="24"/>
-              </w:rPr>
-            </w:pPr>
-            <w:r>
-              <w:rPr>
-                <w:rFonts w:ascii="Power Geez Unicode1" w:hAnsi="Power Geez Unicode1" w:cs="Calibri"/>
-                <w:color w:val="000000"/>
-              </w:rPr>
-              <w:t>XII</w:t>
+                <w:rFonts w:ascii="Power Geez Unicode3" w:hAnsi="Power Geez Unicode3"/>
+                <w:sz w:val="28"/>
+                <w:szCs w:val="28"/>
+              </w:rPr>
+              <w:t>XIII</w:t>
             </w:r>
           </w:p>
         </w:tc>
@@ -916,22 +862,20 @@
               <w:bottom w:val="single" w:sz="4" w:space="0" w:color="000000"/>
               <w:right w:val="single" w:sz="4" w:space="0" w:color="000000"/>
             </w:tcBorders>
-            <w:vAlign w:val="bottom"/>
-          </w:tcPr>
-          <w:p>
-            <w:pPr>
-              <w:jc w:val="right"/>
-              <w:rPr>
-                <w:rFonts w:cs="Calibri"/>
-                <w:color w:val="000000"/>
-                <w:sz w:val="24"/>
-                <w:szCs w:val="24"/>
+          </w:tcPr>
+          <w:p>
+            <w:pPr>
+              <w:rPr>
+                <w:rFonts w:ascii="Power Geez Unicode3" w:hAnsi="Power Geez Unicode3"/>
+                <w:sz w:val="28"/>
+                <w:szCs w:val="28"/>
               </w:rPr>
             </w:pPr>
             <w:r>
               <w:rPr>
-                <w:rFonts w:cs="Calibri"/>
-                <w:color w:val="000000"/>
+                <w:rFonts w:ascii="Power Geez Unicode3" w:hAnsi="Power Geez Unicode3"/>
+                <w:sz w:val="28"/>
+                <w:szCs w:val="28"/>
               </w:rPr>
               <w:t>4</w:t>
             </w:r>
@@ -946,24 +890,22 @@
               <w:bottom w:val="single" w:sz="4" w:space="0" w:color="000000"/>
               <w:right w:val="single" w:sz="4" w:space="0" w:color="000000"/>
             </w:tcBorders>
-            <w:vAlign w:val="center"/>
-          </w:tcPr>
-          <w:p>
-            <w:pPr>
-              <w:jc w:val="both"/>
-              <w:rPr>
-                <w:rFonts w:ascii="Power Geez Unicode1" w:hAnsi="Power Geez Unicode1" w:cs="Calibri"/>
-                <w:color w:val="000000"/>
-                <w:sz w:val="24"/>
-                <w:szCs w:val="24"/>
+          </w:tcPr>
+          <w:p>
+            <w:pPr>
+              <w:rPr>
+                <w:rFonts w:ascii="Power Geez Unicode3" w:hAnsi="Power Geez Unicode3"/>
+                <w:sz w:val="28"/>
+                <w:szCs w:val="28"/>
               </w:rPr>
             </w:pPr>
             <w:r>
               <w:rPr>
-                <w:rFonts w:ascii="Power Geez Unicode1" w:hAnsi="Power Geez Unicode1" w:cs="Calibri"/>
-                <w:color w:val="000000"/>
-              </w:rPr>
-              <w:t xml:space="preserve">አማረ በላቸው </w:t>
+                <w:rFonts w:ascii="Power Geez Unicode3" w:hAnsi="Power Geez Unicode3"/>
+                <w:sz w:val="28"/>
+                <w:szCs w:val="28"/>
+              </w:rPr>
+              <w:t xml:space="preserve">ንፁህ ቡዙአየሁ ሀይሉ </w:t>
             </w:r>
           </w:p>
         </w:tc>
@@ -977,24 +919,22 @@
               <w:right w:val="single" w:sz="4" w:space="0" w:color="000000"/>
             </w:tcBorders>
             <w:shd w:val="clear" w:color="auto" w:fill="FFFFFF" w:themeFill="background1"/>
-            <w:vAlign w:val="center"/>
-          </w:tcPr>
-          <w:p>
-            <w:pPr>
-              <w:jc w:val="both"/>
-              <w:rPr>
-                <w:rFonts w:ascii="Power Geez Unicode1" w:hAnsi="Power Geez Unicode1" w:cs="Calibri"/>
-                <w:color w:val="000000"/>
-                <w:sz w:val="24"/>
-                <w:szCs w:val="24"/>
+          </w:tcPr>
+          <w:p>
+            <w:pPr>
+              <w:rPr>
+                <w:rFonts w:ascii="Power Geez Unicode3" w:hAnsi="Power Geez Unicode3"/>
+                <w:sz w:val="28"/>
+                <w:szCs w:val="28"/>
               </w:rPr>
             </w:pPr>
             <w:r>
               <w:rPr>
-                <w:rFonts w:ascii="Power Geez Unicode1" w:hAnsi="Power Geez Unicode1" w:cs="Calibri"/>
-                <w:color w:val="000000"/>
-              </w:rPr>
-              <w:t>IESO</w:t>
+                <w:rFonts w:ascii="Power Geez Unicode3" w:hAnsi="Power Geez Unicode3"/>
+                <w:sz w:val="28"/>
+                <w:szCs w:val="28"/>
+              </w:rPr>
+              <w:t>አድሚሽን ኦፊሰር</w:t>
             </w:r>
           </w:p>
         </w:tc>
@@ -1019,51 +959,33 @@
                 <w:lang w:val="am-ET"/>
               </w:rPr>
             </w:pPr>
+          </w:p>
+        </w:tc>
+        <w:tc>
+          <w:tcPr>
+            <w:tcW w:w="0" w:type="auto"/>
+            <w:tcBorders>
+              <w:top w:val="single" w:sz="4" w:space="0" w:color="000000"/>
+              <w:left w:val="single" w:sz="4" w:space="0" w:color="000000"/>
+              <w:bottom w:val="single" w:sz="4" w:space="0" w:color="000000"/>
+              <w:right w:val="single" w:sz="4" w:space="0" w:color="auto"/>
+            </w:tcBorders>
+          </w:tcPr>
+          <w:p>
+            <w:pPr>
+              <w:rPr>
+                <w:rFonts w:ascii="Power Geez Unicode3" w:hAnsi="Power Geez Unicode3"/>
+                <w:sz w:val="28"/>
+                <w:szCs w:val="28"/>
+              </w:rPr>
+            </w:pPr>
             <w:r>
               <w:rPr>
-                <w:rFonts w:ascii="Power Geez Unicode1" w:eastAsia="Times New Roman" w:hAnsi="Power Geez Unicode1"/>
-                <w:sz w:val="20"/>
-                <w:szCs w:val="20"/>
-              </w:rPr>
-              <w:t>13.6</w:t>
-            </w:r>
-            <w:r>
-              <w:rPr>
-                <w:rFonts w:ascii="Power Geez Unicode1" w:eastAsia="Times New Roman" w:hAnsi="Power Geez Unicode1"/>
-                <w:sz w:val="20"/>
-                <w:szCs w:val="20"/>
-              </w:rPr>
-              <w:t>/አዲ-አ/ሆሰ--</w:t>
-            </w:r>
-          </w:p>
-        </w:tc>
-        <w:tc>
-          <w:tcPr>
-            <w:tcW w:w="0" w:type="auto"/>
-            <w:tcBorders>
-              <w:top w:val="single" w:sz="4" w:space="0" w:color="000000"/>
-              <w:left w:val="single" w:sz="4" w:space="0" w:color="000000"/>
-              <w:bottom w:val="single" w:sz="4" w:space="0" w:color="000000"/>
-              <w:right w:val="single" w:sz="4" w:space="0" w:color="auto"/>
-            </w:tcBorders>
-            <w:vAlign w:val="center"/>
-          </w:tcPr>
-          <w:p>
-            <w:pPr>
-              <w:jc w:val="both"/>
-              <w:rPr>
-                <w:rFonts w:ascii="Power Geez Unicode1" w:hAnsi="Power Geez Unicode1" w:cs="Calibri"/>
-                <w:color w:val="000000"/>
-                <w:sz w:val="24"/>
-                <w:szCs w:val="24"/>
-              </w:rPr>
-            </w:pPr>
-            <w:r>
-              <w:rPr>
-                <w:rFonts w:ascii="Power Geez Unicode1" w:hAnsi="Power Geez Unicode1" w:cs="Calibri"/>
-                <w:color w:val="000000"/>
-              </w:rPr>
-              <w:t>ካሪየር</w:t>
+                <w:rFonts w:ascii="Power Geez Unicode3" w:hAnsi="Power Geez Unicode3"/>
+                <w:sz w:val="28"/>
+                <w:szCs w:val="28"/>
+              </w:rPr>
+              <w:t>XV</w:t>
             </w:r>
           </w:p>
         </w:tc>
@@ -1105,22 +1027,20 @@
               <w:bottom w:val="single" w:sz="4" w:space="0" w:color="000000"/>
               <w:right w:val="single" w:sz="4" w:space="0" w:color="000000"/>
             </w:tcBorders>
-            <w:vAlign w:val="bottom"/>
-          </w:tcPr>
-          <w:p>
-            <w:pPr>
-              <w:jc w:val="right"/>
-              <w:rPr>
-                <w:rFonts w:cs="Calibri"/>
-                <w:color w:val="000000"/>
-                <w:sz w:val="24"/>
-                <w:szCs w:val="24"/>
+          </w:tcPr>
+          <w:p>
+            <w:pPr>
+              <w:rPr>
+                <w:rFonts w:ascii="Power Geez Unicode3" w:hAnsi="Power Geez Unicode3"/>
+                <w:sz w:val="28"/>
+                <w:szCs w:val="28"/>
               </w:rPr>
             </w:pPr>
             <w:r>
               <w:rPr>
-                <w:rFonts w:cs="Calibri"/>
-                <w:color w:val="000000"/>
+                <w:rFonts w:ascii="Power Geez Unicode3" w:hAnsi="Power Geez Unicode3"/>
+                <w:sz w:val="28"/>
+                <w:szCs w:val="28"/>
               </w:rPr>
               <w:t>5</w:t>
             </w:r>
@@ -1135,24 +1055,22 @@
               <w:bottom w:val="single" w:sz="4" w:space="0" w:color="000000"/>
               <w:right w:val="single" w:sz="4" w:space="0" w:color="000000"/>
             </w:tcBorders>
-            <w:vAlign w:val="center"/>
-          </w:tcPr>
-          <w:p>
-            <w:pPr>
-              <w:jc w:val="both"/>
-              <w:rPr>
-                <w:rFonts w:ascii="Power Geez Unicode1" w:hAnsi="Power Geez Unicode1" w:cs="Calibri"/>
-                <w:color w:val="000000"/>
-                <w:sz w:val="24"/>
-                <w:szCs w:val="24"/>
+          </w:tcPr>
+          <w:p>
+            <w:pPr>
+              <w:rPr>
+                <w:rFonts w:ascii="Power Geez Unicode3" w:hAnsi="Power Geez Unicode3"/>
+                <w:sz w:val="28"/>
+                <w:szCs w:val="28"/>
               </w:rPr>
             </w:pPr>
             <w:r>
               <w:rPr>
-                <w:rFonts w:ascii="Power Geez Unicode1" w:hAnsi="Power Geez Unicode1" w:cs="Calibri"/>
-                <w:color w:val="000000"/>
-              </w:rPr>
-              <w:t xml:space="preserve">ጥላዬ መንግስት </w:t>
+                <w:rFonts w:ascii="Power Geez Unicode3" w:hAnsi="Power Geez Unicode3"/>
+                <w:sz w:val="28"/>
+                <w:szCs w:val="28"/>
+              </w:rPr>
+              <w:t xml:space="preserve">ሚኪያስ ለአለም ብርሃን </w:t>
             </w:r>
           </w:p>
         </w:tc>
@@ -1166,24 +1084,22 @@
               <w:right w:val="single" w:sz="4" w:space="0" w:color="000000"/>
             </w:tcBorders>
             <w:shd w:val="clear" w:color="auto" w:fill="FFFFFF" w:themeFill="background1"/>
-            <w:vAlign w:val="center"/>
-          </w:tcPr>
-          <w:p>
-            <w:pPr>
-              <w:jc w:val="both"/>
-              <w:rPr>
-                <w:rFonts w:ascii="Power Geez Unicode1" w:hAnsi="Power Geez Unicode1" w:cs="Calibri"/>
-                <w:color w:val="000000"/>
-                <w:sz w:val="24"/>
-                <w:szCs w:val="24"/>
+          </w:tcPr>
+          <w:p>
+            <w:pPr>
+              <w:rPr>
+                <w:rFonts w:ascii="Power Geez Unicode3" w:hAnsi="Power Geez Unicode3"/>
+                <w:sz w:val="28"/>
+                <w:szCs w:val="28"/>
               </w:rPr>
             </w:pPr>
             <w:r>
               <w:rPr>
-                <w:rFonts w:ascii="Power Geez Unicode1" w:hAnsi="Power Geez Unicode1" w:cs="Calibri"/>
-                <w:color w:val="000000"/>
-              </w:rPr>
-              <w:t>IESO</w:t>
+                <w:rFonts w:ascii="Power Geez Unicode3" w:hAnsi="Power Geez Unicode3"/>
+                <w:sz w:val="28"/>
+                <w:szCs w:val="28"/>
+              </w:rPr>
+              <w:t>HO</w:t>
             </w:r>
           </w:p>
         </w:tc>
@@ -1208,51 +1124,33 @@
                 <w:lang w:val="am-ET"/>
               </w:rPr>
             </w:pPr>
+          </w:p>
+        </w:tc>
+        <w:tc>
+          <w:tcPr>
+            <w:tcW w:w="0" w:type="auto"/>
+            <w:tcBorders>
+              <w:top w:val="single" w:sz="4" w:space="0" w:color="000000"/>
+              <w:left w:val="single" w:sz="4" w:space="0" w:color="000000"/>
+              <w:bottom w:val="single" w:sz="4" w:space="0" w:color="000000"/>
+              <w:right w:val="single" w:sz="4" w:space="0" w:color="auto"/>
+            </w:tcBorders>
+          </w:tcPr>
+          <w:p>
+            <w:pPr>
+              <w:rPr>
+                <w:rFonts w:ascii="Power Geez Unicode3" w:hAnsi="Power Geez Unicode3"/>
+                <w:sz w:val="28"/>
+                <w:szCs w:val="28"/>
+              </w:rPr>
+            </w:pPr>
             <w:r>
               <w:rPr>
-                <w:rFonts w:ascii="Power Geez Unicode1" w:eastAsia="Times New Roman" w:hAnsi="Power Geez Unicode1"/>
-                <w:sz w:val="20"/>
-                <w:szCs w:val="20"/>
-              </w:rPr>
-              <w:t>13.6</w:t>
-            </w:r>
-            <w:r>
-              <w:rPr>
-                <w:rFonts w:ascii="Power Geez Unicode1" w:eastAsia="Times New Roman" w:hAnsi="Power Geez Unicode1"/>
-                <w:sz w:val="20"/>
-                <w:szCs w:val="20"/>
-              </w:rPr>
-              <w:t>/አዲ-አ/ሆሰ--</w:t>
-            </w:r>
-          </w:p>
-        </w:tc>
-        <w:tc>
-          <w:tcPr>
-            <w:tcW w:w="0" w:type="auto"/>
-            <w:tcBorders>
-              <w:top w:val="single" w:sz="4" w:space="0" w:color="000000"/>
-              <w:left w:val="single" w:sz="4" w:space="0" w:color="000000"/>
-              <w:bottom w:val="single" w:sz="4" w:space="0" w:color="000000"/>
-              <w:right w:val="single" w:sz="4" w:space="0" w:color="auto"/>
-            </w:tcBorders>
-            <w:vAlign w:val="center"/>
-          </w:tcPr>
-          <w:p>
-            <w:pPr>
-              <w:jc w:val="both"/>
-              <w:rPr>
-                <w:rFonts w:ascii="Power Geez Unicode1" w:hAnsi="Power Geez Unicode1" w:cs="Calibri"/>
-                <w:color w:val="000000"/>
-                <w:sz w:val="24"/>
-                <w:szCs w:val="24"/>
-              </w:rPr>
-            </w:pPr>
-            <w:r>
-              <w:rPr>
-                <w:rFonts w:ascii="Power Geez Unicode1" w:hAnsi="Power Geez Unicode1" w:cs="Calibri"/>
-                <w:color w:val="000000"/>
-              </w:rPr>
-              <w:t>ካሪየር</w:t>
+                <w:rFonts w:ascii="Power Geez Unicode3" w:hAnsi="Power Geez Unicode3"/>
+                <w:sz w:val="28"/>
+                <w:szCs w:val="28"/>
+              </w:rPr>
+              <w:t>XIII</w:t>
             </w:r>
           </w:p>
         </w:tc>
@@ -1294,22 +1192,22 @@
               <w:bottom w:val="single" w:sz="4" w:space="0" w:color="000000"/>
               <w:right w:val="single" w:sz="4" w:space="0" w:color="000000"/>
             </w:tcBorders>
-            <w:vAlign w:val="bottom"/>
-          </w:tcPr>
-          <w:p>
-            <w:pPr>
-              <w:jc w:val="right"/>
-              <w:rPr>
-                <w:rFonts w:cs="Calibri"/>
-                <w:color w:val="000000"/>
-                <w:sz w:val="24"/>
-                <w:szCs w:val="24"/>
+          </w:tcPr>
+          <w:p>
+            <w:pPr>
+              <w:rPr>
+                <w:rFonts w:ascii="Power Geez Unicode3" w:hAnsi="Power Geez Unicode3"/>
+                <w:sz w:val="28"/>
+                <w:szCs w:val="28"/>
+                <w:highlight w:val="yellow"/>
               </w:rPr>
             </w:pPr>
             <w:r>
               <w:rPr>
-                <w:rFonts w:cs="Calibri"/>
-                <w:color w:val="000000"/>
+                <w:rFonts w:ascii="Power Geez Unicode3" w:hAnsi="Power Geez Unicode3"/>
+                <w:sz w:val="28"/>
+                <w:szCs w:val="28"/>
+                <w:highlight w:val="yellow"/>
               </w:rPr>
               <w:t>6</w:t>
             </w:r>
@@ -1324,55 +1222,46 @@
               <w:bottom w:val="single" w:sz="4" w:space="0" w:color="000000"/>
               <w:right w:val="single" w:sz="4" w:space="0" w:color="000000"/>
             </w:tcBorders>
-            <w:vAlign w:val="center"/>
-          </w:tcPr>
-          <w:p>
-            <w:pPr>
-              <w:jc w:val="both"/>
-              <w:rPr>
-                <w:rFonts w:ascii="Power Geez Unicode1" w:hAnsi="Power Geez Unicode1" w:cs="Calibri"/>
-                <w:color w:val="000000"/>
-                <w:sz w:val="24"/>
-                <w:szCs w:val="24"/>
+          </w:tcPr>
+          <w:p>
+            <w:pPr>
+              <w:rPr>
+                <w:rFonts w:ascii="Power Geez Unicode3" w:hAnsi="Power Geez Unicode3"/>
+                <w:sz w:val="28"/>
+                <w:szCs w:val="28"/>
+                <w:highlight w:val="yellow"/>
+              </w:rPr>
+            </w:pPr>
+          </w:p>
+        </w:tc>
+        <w:tc>
+          <w:tcPr>
+            <w:tcW w:w="0" w:type="auto"/>
+            <w:tcBorders>
+              <w:top w:val="single" w:sz="4" w:space="0" w:color="000000"/>
+              <w:left w:val="single" w:sz="4" w:space="0" w:color="000000"/>
+              <w:bottom w:val="single" w:sz="4" w:space="0" w:color="000000"/>
+              <w:right w:val="single" w:sz="4" w:space="0" w:color="000000"/>
+            </w:tcBorders>
+            <w:shd w:val="clear" w:color="auto" w:fill="FFFFFF" w:themeFill="background1"/>
+          </w:tcPr>
+          <w:p>
+            <w:pPr>
+              <w:rPr>
+                <w:rFonts w:ascii="Power Geez Unicode3" w:hAnsi="Power Geez Unicode3"/>
+                <w:sz w:val="28"/>
+                <w:szCs w:val="28"/>
+                <w:highlight w:val="yellow"/>
               </w:rPr>
             </w:pPr>
             <w:r>
               <w:rPr>
-                <w:rFonts w:ascii="Power Geez Unicode1" w:hAnsi="Power Geez Unicode1" w:cs="Calibri"/>
-                <w:color w:val="000000"/>
-              </w:rPr>
-              <w:t xml:space="preserve">ተመስገን ተፈራ </w:t>
-            </w:r>
-          </w:p>
-        </w:tc>
-        <w:tc>
-          <w:tcPr>
-            <w:tcW w:w="0" w:type="auto"/>
-            <w:tcBorders>
-              <w:top w:val="single" w:sz="4" w:space="0" w:color="000000"/>
-              <w:left w:val="single" w:sz="4" w:space="0" w:color="000000"/>
-              <w:bottom w:val="single" w:sz="4" w:space="0" w:color="000000"/>
-              <w:right w:val="single" w:sz="4" w:space="0" w:color="000000"/>
-            </w:tcBorders>
-            <w:shd w:val="clear" w:color="auto" w:fill="FFFFFF" w:themeFill="background1"/>
-            <w:vAlign w:val="center"/>
-          </w:tcPr>
-          <w:p>
-            <w:pPr>
-              <w:jc w:val="both"/>
-              <w:rPr>
-                <w:rFonts w:ascii="Power Geez Unicode1" w:hAnsi="Power Geez Unicode1" w:cs="Calibri"/>
-                <w:color w:val="000000"/>
-                <w:sz w:val="24"/>
-                <w:szCs w:val="24"/>
-              </w:rPr>
-            </w:pPr>
-            <w:r>
-              <w:rPr>
-                <w:rFonts w:ascii="Power Geez Unicode1" w:hAnsi="Power Geez Unicode1" w:cs="Calibri"/>
-                <w:color w:val="000000"/>
-              </w:rPr>
-              <w:t xml:space="preserve">እግረኛ ፖስተኛ </w:t>
+                <w:rFonts w:ascii="Power Geez Unicode3" w:hAnsi="Power Geez Unicode3"/>
+                <w:sz w:val="28"/>
+                <w:szCs w:val="28"/>
+                <w:highlight w:val="yellow"/>
+              </w:rPr>
+              <w:t>እግረኛ ፖስተኛ</w:t>
             </w:r>
           </w:p>
         </w:tc>
@@ -1397,49 +1286,31 @@
                 <w:lang w:val="am-ET"/>
               </w:rPr>
             </w:pPr>
+          </w:p>
+        </w:tc>
+        <w:tc>
+          <w:tcPr>
+            <w:tcW w:w="0" w:type="auto"/>
+            <w:tcBorders>
+              <w:top w:val="single" w:sz="4" w:space="0" w:color="000000"/>
+              <w:left w:val="single" w:sz="4" w:space="0" w:color="000000"/>
+              <w:bottom w:val="single" w:sz="4" w:space="0" w:color="000000"/>
+              <w:right w:val="single" w:sz="4" w:space="0" w:color="auto"/>
+            </w:tcBorders>
+          </w:tcPr>
+          <w:p>
+            <w:pPr>
+              <w:rPr>
+                <w:rFonts w:ascii="Power Geez Unicode3" w:hAnsi="Power Geez Unicode3"/>
+                <w:sz w:val="28"/>
+                <w:szCs w:val="28"/>
+              </w:rPr>
+            </w:pPr>
             <w:r>
               <w:rPr>
-                <w:rFonts w:ascii="Power Geez Unicode1" w:eastAsia="Times New Roman" w:hAnsi="Power Geez Unicode1"/>
-                <w:sz w:val="20"/>
-                <w:szCs w:val="20"/>
-              </w:rPr>
-              <w:t>13.6</w:t>
-            </w:r>
-            <w:r>
-              <w:rPr>
-                <w:rFonts w:ascii="Power Geez Unicode1" w:eastAsia="Times New Roman" w:hAnsi="Power Geez Unicode1"/>
-                <w:sz w:val="20"/>
-                <w:szCs w:val="20"/>
-              </w:rPr>
-              <w:t>/አዲ-አ/ሆሰ--</w:t>
-            </w:r>
-          </w:p>
-        </w:tc>
-        <w:tc>
-          <w:tcPr>
-            <w:tcW w:w="0" w:type="auto"/>
-            <w:tcBorders>
-              <w:top w:val="single" w:sz="4" w:space="0" w:color="000000"/>
-              <w:left w:val="single" w:sz="4" w:space="0" w:color="000000"/>
-              <w:bottom w:val="single" w:sz="4" w:space="0" w:color="000000"/>
-              <w:right w:val="single" w:sz="4" w:space="0" w:color="auto"/>
-            </w:tcBorders>
-            <w:vAlign w:val="center"/>
-          </w:tcPr>
-          <w:p>
-            <w:pPr>
-              <w:jc w:val="both"/>
-              <w:rPr>
-                <w:rFonts w:ascii="Power Geez Unicode1" w:hAnsi="Power Geez Unicode1" w:cs="Calibri"/>
-                <w:color w:val="000000"/>
-                <w:sz w:val="24"/>
-                <w:szCs w:val="24"/>
-              </w:rPr>
-            </w:pPr>
-            <w:r>
-              <w:rPr>
-                <w:rFonts w:ascii="Power Geez Unicode1" w:hAnsi="Power Geez Unicode1" w:cs="Calibri"/>
-                <w:color w:val="000000"/>
+                <w:rFonts w:ascii="Power Geez Unicode3" w:hAnsi="Power Geez Unicode3"/>
+                <w:sz w:val="28"/>
+                <w:szCs w:val="28"/>
               </w:rPr>
               <w:t>III</w:t>
             </w:r>
@@ -1483,22 +1354,22 @@
               <w:bottom w:val="single" w:sz="4" w:space="0" w:color="000000"/>
               <w:right w:val="single" w:sz="4" w:space="0" w:color="000000"/>
             </w:tcBorders>
-            <w:vAlign w:val="bottom"/>
-          </w:tcPr>
-          <w:p>
-            <w:pPr>
-              <w:jc w:val="right"/>
-              <w:rPr>
-                <w:rFonts w:cs="Calibri"/>
-                <w:color w:val="000000"/>
-                <w:sz w:val="24"/>
-                <w:szCs w:val="24"/>
+          </w:tcPr>
+          <w:p>
+            <w:pPr>
+              <w:rPr>
+                <w:rFonts w:ascii="Power Geez Unicode3" w:hAnsi="Power Geez Unicode3"/>
+                <w:sz w:val="28"/>
+                <w:szCs w:val="28"/>
+                <w:highlight w:val="yellow"/>
               </w:rPr>
             </w:pPr>
             <w:r>
               <w:rPr>
-                <w:rFonts w:cs="Calibri"/>
-                <w:color w:val="000000"/>
+                <w:rFonts w:ascii="Power Geez Unicode3" w:hAnsi="Power Geez Unicode3"/>
+                <w:sz w:val="28"/>
+                <w:szCs w:val="28"/>
+                <w:highlight w:val="yellow"/>
               </w:rPr>
               <w:t>7</w:t>
             </w:r>
@@ -1513,55 +1384,46 @@
               <w:bottom w:val="single" w:sz="4" w:space="0" w:color="000000"/>
               <w:right w:val="single" w:sz="4" w:space="0" w:color="000000"/>
             </w:tcBorders>
-            <w:vAlign w:val="center"/>
-          </w:tcPr>
-          <w:p>
-            <w:pPr>
-              <w:jc w:val="both"/>
-              <w:rPr>
-                <w:rFonts w:ascii="Power Geez Unicode1" w:hAnsi="Power Geez Unicode1" w:cs="Calibri"/>
-                <w:color w:val="000000"/>
-                <w:sz w:val="24"/>
-                <w:szCs w:val="24"/>
+          </w:tcPr>
+          <w:p>
+            <w:pPr>
+              <w:rPr>
+                <w:rFonts w:ascii="Power Geez Unicode3" w:hAnsi="Power Geez Unicode3"/>
+                <w:sz w:val="28"/>
+                <w:szCs w:val="28"/>
+                <w:highlight w:val="yellow"/>
+              </w:rPr>
+            </w:pPr>
+          </w:p>
+        </w:tc>
+        <w:tc>
+          <w:tcPr>
+            <w:tcW w:w="0" w:type="auto"/>
+            <w:tcBorders>
+              <w:top w:val="single" w:sz="4" w:space="0" w:color="000000"/>
+              <w:left w:val="single" w:sz="4" w:space="0" w:color="000000"/>
+              <w:bottom w:val="single" w:sz="4" w:space="0" w:color="000000"/>
+              <w:right w:val="single" w:sz="4" w:space="0" w:color="000000"/>
+            </w:tcBorders>
+            <w:shd w:val="clear" w:color="auto" w:fill="FFFFFF" w:themeFill="background1"/>
+          </w:tcPr>
+          <w:p>
+            <w:pPr>
+              <w:rPr>
+                <w:rFonts w:ascii="Power Geez Unicode3" w:hAnsi="Power Geez Unicode3"/>
+                <w:sz w:val="28"/>
+                <w:szCs w:val="28"/>
+                <w:highlight w:val="yellow"/>
               </w:rPr>
             </w:pPr>
             <w:r>
               <w:rPr>
-                <w:rFonts w:ascii="Power Geez Unicode1" w:hAnsi="Power Geez Unicode1" w:cs="Calibri"/>
-                <w:color w:val="000000"/>
-              </w:rPr>
-              <w:t>ብዙአየሁ ሞላ</w:t>
-            </w:r>
-          </w:p>
-        </w:tc>
-        <w:tc>
-          <w:tcPr>
-            <w:tcW w:w="0" w:type="auto"/>
-            <w:tcBorders>
-              <w:top w:val="single" w:sz="4" w:space="0" w:color="000000"/>
-              <w:left w:val="single" w:sz="4" w:space="0" w:color="000000"/>
-              <w:bottom w:val="single" w:sz="4" w:space="0" w:color="000000"/>
-              <w:right w:val="single" w:sz="4" w:space="0" w:color="000000"/>
-            </w:tcBorders>
-            <w:shd w:val="clear" w:color="auto" w:fill="FFFFFF" w:themeFill="background1"/>
-            <w:vAlign w:val="center"/>
-          </w:tcPr>
-          <w:p>
-            <w:pPr>
-              <w:jc w:val="both"/>
-              <w:rPr>
-                <w:rFonts w:ascii="Power Geez Unicode1" w:hAnsi="Power Geez Unicode1" w:cs="Calibri"/>
-                <w:color w:val="000000"/>
-                <w:sz w:val="24"/>
-                <w:szCs w:val="24"/>
-              </w:rPr>
-            </w:pPr>
-            <w:r>
-              <w:rPr>
-                <w:rFonts w:ascii="Power Geez Unicode1" w:hAnsi="Power Geez Unicode1" w:cs="Calibri"/>
-                <w:color w:val="000000"/>
-              </w:rPr>
-              <w:t xml:space="preserve">ባዩ ሜደካል ቴክኒሽያን </w:t>
+                <w:rFonts w:ascii="Power Geez Unicode3" w:hAnsi="Power Geez Unicode3"/>
+                <w:sz w:val="28"/>
+                <w:szCs w:val="28"/>
+                <w:highlight w:val="yellow"/>
+              </w:rPr>
+              <w:t>አትክልተኛ</w:t>
             </w:r>
           </w:p>
         </w:tc>
@@ -1586,457 +1448,60 @@
                 <w:lang w:val="am-ET"/>
               </w:rPr>
             </w:pPr>
+          </w:p>
+        </w:tc>
+        <w:tc>
+          <w:tcPr>
+            <w:tcW w:w="0" w:type="auto"/>
+            <w:tcBorders>
+              <w:top w:val="single" w:sz="4" w:space="0" w:color="000000"/>
+              <w:left w:val="single" w:sz="4" w:space="0" w:color="000000"/>
+              <w:bottom w:val="single" w:sz="4" w:space="0" w:color="000000"/>
+              <w:right w:val="single" w:sz="4" w:space="0" w:color="auto"/>
+            </w:tcBorders>
+          </w:tcPr>
+          <w:p>
+            <w:pPr>
+              <w:rPr>
+                <w:rFonts w:ascii="Power Geez Unicode3" w:hAnsi="Power Geez Unicode3"/>
+                <w:sz w:val="28"/>
+                <w:szCs w:val="28"/>
+              </w:rPr>
+            </w:pPr>
             <w:r>
+              <w:rPr>
+                <w:rFonts w:ascii="Power Geez Unicode3" w:hAnsi="Power Geez Unicode3"/>
+                <w:sz w:val="28"/>
+                <w:szCs w:val="28"/>
+              </w:rPr>
+              <w:t>III</w:t>
+            </w:r>
+          </w:p>
+        </w:tc>
+        <w:tc>
+          <w:tcPr>
+            <w:tcW w:w="0" w:type="auto"/>
+            <w:tcBorders>
+              <w:top w:val="single" w:sz="4" w:space="0" w:color="000000"/>
+              <w:left w:val="single" w:sz="4" w:space="0" w:color="auto"/>
+              <w:bottom w:val="single" w:sz="4" w:space="0" w:color="000000"/>
+              <w:right w:val="single" w:sz="4" w:space="0" w:color="000000"/>
+            </w:tcBorders>
+            <w:vAlign w:val="bottom"/>
+          </w:tcPr>
+          <w:p>
+            <w:pPr>
+              <w:spacing w:after="0" w:line="240" w:lineRule="auto"/>
+              <w:jc w:val="center"/>
               <w:rPr>
                 <w:rFonts w:ascii="Power Geez Unicode1" w:eastAsia="Times New Roman" w:hAnsi="Power Geez Unicode1"/>
                 <w:sz w:val="20"/>
                 <w:szCs w:val="20"/>
               </w:rPr>
-              <w:t>13.6</w:t>
-            </w:r>
-            <w:r>
-              <w:rPr>
-                <w:rFonts w:ascii="Power Geez Unicode1" w:eastAsia="Times New Roman" w:hAnsi="Power Geez Unicode1"/>
-                <w:sz w:val="20"/>
-                <w:szCs w:val="20"/>
-              </w:rPr>
-              <w:t>/አዲ-አ/ሆሰ--</w:t>
-            </w:r>
-          </w:p>
-        </w:tc>
-        <w:tc>
-          <w:tcPr>
-            <w:tcW w:w="0" w:type="auto"/>
-            <w:tcBorders>
-              <w:top w:val="single" w:sz="4" w:space="0" w:color="000000"/>
-              <w:left w:val="single" w:sz="4" w:space="0" w:color="000000"/>
-              <w:bottom w:val="single" w:sz="4" w:space="0" w:color="000000"/>
-              <w:right w:val="single" w:sz="4" w:space="0" w:color="auto"/>
-            </w:tcBorders>
-            <w:vAlign w:val="center"/>
-          </w:tcPr>
-          <w:p>
-            <w:pPr>
-              <w:jc w:val="both"/>
-              <w:rPr>
-                <w:rFonts w:ascii="Power Geez Unicode1" w:hAnsi="Power Geez Unicode1" w:cs="Calibri"/>
-                <w:color w:val="000000"/>
-                <w:sz w:val="24"/>
-                <w:szCs w:val="24"/>
-              </w:rPr>
-            </w:pPr>
-            <w:r>
-              <w:rPr>
-                <w:rFonts w:ascii="Power Geez Unicode1" w:hAnsi="Power Geez Unicode1" w:cs="Calibri"/>
-                <w:color w:val="000000"/>
-              </w:rPr>
-              <w:t>ካሪየር</w:t>
-            </w:r>
-          </w:p>
-        </w:tc>
-        <w:tc>
-          <w:tcPr>
-            <w:tcW w:w="0" w:type="auto"/>
-            <w:tcBorders>
-              <w:top w:val="single" w:sz="4" w:space="0" w:color="000000"/>
-              <w:left w:val="single" w:sz="4" w:space="0" w:color="auto"/>
-              <w:bottom w:val="single" w:sz="4" w:space="0" w:color="000000"/>
-              <w:right w:val="single" w:sz="4" w:space="0" w:color="000000"/>
-            </w:tcBorders>
-            <w:vAlign w:val="bottom"/>
-          </w:tcPr>
-          <w:p>
-            <w:pPr>
-              <w:spacing w:after="0" w:line="240" w:lineRule="auto"/>
-              <w:jc w:val="center"/>
-              <w:rPr>
-                <w:rFonts w:ascii="Power Geez Unicode1" w:eastAsia="Times New Roman" w:hAnsi="Power Geez Unicode1"/>
-                <w:sz w:val="20"/>
-                <w:szCs w:val="20"/>
-              </w:rPr>
             </w:pPr>
           </w:p>
         </w:tc>
       </w:tr>
-      <w:tr>
-        <w:trPr>
-          <w:trHeight w:val="50"/>
-          <w:jc w:val="center"/>
-        </w:trPr>
-        <w:tc>
-          <w:tcPr>
-            <w:tcW w:w="0" w:type="auto"/>
-            <w:tcBorders>
-              <w:top w:val="single" w:sz="4" w:space="0" w:color="000000"/>
-              <w:left w:val="single" w:sz="4" w:space="0" w:color="000000"/>
-              <w:bottom w:val="single" w:sz="4" w:space="0" w:color="000000"/>
-              <w:right w:val="single" w:sz="4" w:space="0" w:color="000000"/>
-            </w:tcBorders>
-            <w:vAlign w:val="bottom"/>
-          </w:tcPr>
-          <w:p>
-            <w:pPr>
-              <w:jc w:val="right"/>
-              <w:rPr>
-                <w:rFonts w:cs="Calibri"/>
-                <w:color w:val="000000"/>
-                <w:sz w:val="24"/>
-                <w:szCs w:val="24"/>
-              </w:rPr>
-            </w:pPr>
-            <w:r>
-              <w:rPr>
-                <w:rFonts w:cs="Calibri"/>
-                <w:color w:val="000000"/>
-              </w:rPr>
-              <w:t>8</w:t>
-            </w:r>
-          </w:p>
-        </w:tc>
-        <w:tc>
-          <w:tcPr>
-            <w:tcW w:w="0" w:type="auto"/>
-            <w:tcBorders>
-              <w:top w:val="single" w:sz="4" w:space="0" w:color="000000"/>
-              <w:left w:val="single" w:sz="4" w:space="0" w:color="000000"/>
-              <w:bottom w:val="single" w:sz="4" w:space="0" w:color="000000"/>
-              <w:right w:val="single" w:sz="4" w:space="0" w:color="000000"/>
-            </w:tcBorders>
-            <w:vAlign w:val="center"/>
-          </w:tcPr>
-          <w:p>
-            <w:pPr>
-              <w:jc w:val="both"/>
-              <w:rPr>
-                <w:rFonts w:ascii="Power Geez Unicode1" w:hAnsi="Power Geez Unicode1" w:cs="Calibri"/>
-                <w:color w:val="000000"/>
-                <w:sz w:val="24"/>
-                <w:szCs w:val="24"/>
-              </w:rPr>
-            </w:pPr>
-            <w:r>
-              <w:rPr>
-                <w:rFonts w:ascii="Power Geez Unicode1" w:hAnsi="Power Geez Unicode1" w:cs="Calibri"/>
-                <w:color w:val="000000"/>
-              </w:rPr>
-              <w:t xml:space="preserve">ዳንኤል ደመቀ </w:t>
-            </w:r>
-          </w:p>
-        </w:tc>
-        <w:tc>
-          <w:tcPr>
-            <w:tcW w:w="0" w:type="auto"/>
-            <w:tcBorders>
-              <w:top w:val="single" w:sz="4" w:space="0" w:color="000000"/>
-              <w:left w:val="single" w:sz="4" w:space="0" w:color="000000"/>
-              <w:bottom w:val="single" w:sz="4" w:space="0" w:color="000000"/>
-              <w:right w:val="single" w:sz="4" w:space="0" w:color="000000"/>
-            </w:tcBorders>
-            <w:shd w:val="clear" w:color="auto" w:fill="FFFFFF" w:themeFill="background1"/>
-            <w:vAlign w:val="center"/>
-          </w:tcPr>
-          <w:p>
-            <w:pPr>
-              <w:jc w:val="both"/>
-              <w:rPr>
-                <w:rFonts w:ascii="Power Geez Unicode1" w:hAnsi="Power Geez Unicode1" w:cs="Calibri"/>
-                <w:color w:val="000000"/>
-                <w:sz w:val="24"/>
-                <w:szCs w:val="24"/>
-              </w:rPr>
-            </w:pPr>
-            <w:r>
-              <w:rPr>
-                <w:rFonts w:ascii="Power Geez Unicode1" w:hAnsi="Power Geez Unicode1" w:cs="Calibri"/>
-                <w:color w:val="000000"/>
-              </w:rPr>
-              <w:t>ባዩ ሜዲካል ቴክኒሽያን</w:t>
-            </w:r>
-          </w:p>
-        </w:tc>
-        <w:tc>
-          <w:tcPr>
-            <w:tcW w:w="0" w:type="auto"/>
-            <w:tcBorders>
-              <w:top w:val="single" w:sz="4" w:space="0" w:color="000000"/>
-              <w:left w:val="single" w:sz="4" w:space="0" w:color="000000"/>
-              <w:bottom w:val="single" w:sz="4" w:space="0" w:color="000000"/>
-              <w:right w:val="single" w:sz="4" w:space="0" w:color="000000"/>
-            </w:tcBorders>
-            <w:vAlign w:val="center"/>
-          </w:tcPr>
-          <w:p>
-            <w:pPr>
-              <w:spacing w:after="0" w:line="240" w:lineRule="auto"/>
-              <w:rPr>
-                <w:rFonts w:ascii="Nyala" w:eastAsia="Times New Roman" w:hAnsi="Nyala"/>
-                <w:sz w:val="20"/>
-                <w:szCs w:val="20"/>
-                <w:lang w:val="am-ET"/>
-              </w:rPr>
-            </w:pPr>
-            <w:r>
-              <w:rPr>
-                <w:rFonts w:ascii="Power Geez Unicode1" w:eastAsia="Times New Roman" w:hAnsi="Power Geez Unicode1"/>
-                <w:sz w:val="20"/>
-                <w:szCs w:val="20"/>
-              </w:rPr>
-              <w:t>13.6</w:t>
-            </w:r>
-            <w:r>
-              <w:rPr>
-                <w:rFonts w:ascii="Power Geez Unicode1" w:eastAsia="Times New Roman" w:hAnsi="Power Geez Unicode1"/>
-                <w:sz w:val="20"/>
-                <w:szCs w:val="20"/>
-              </w:rPr>
-              <w:t>/አዲ-አ/ሆሰ--</w:t>
-            </w:r>
-          </w:p>
-        </w:tc>
-        <w:tc>
-          <w:tcPr>
-            <w:tcW w:w="0" w:type="auto"/>
-            <w:tcBorders>
-              <w:top w:val="single" w:sz="4" w:space="0" w:color="000000"/>
-              <w:left w:val="single" w:sz="4" w:space="0" w:color="000000"/>
-              <w:bottom w:val="single" w:sz="4" w:space="0" w:color="000000"/>
-              <w:right w:val="single" w:sz="4" w:space="0" w:color="auto"/>
-            </w:tcBorders>
-            <w:vAlign w:val="center"/>
-          </w:tcPr>
-          <w:p>
-            <w:pPr>
-              <w:jc w:val="both"/>
-              <w:rPr>
-                <w:rFonts w:ascii="Power Geez Unicode1" w:hAnsi="Power Geez Unicode1" w:cs="Calibri"/>
-                <w:color w:val="000000"/>
-                <w:sz w:val="24"/>
-                <w:szCs w:val="24"/>
-              </w:rPr>
-            </w:pPr>
-            <w:r>
-              <w:rPr>
-                <w:rFonts w:ascii="Power Geez Unicode1" w:hAnsi="Power Geez Unicode1" w:cs="Calibri"/>
-                <w:color w:val="000000"/>
-              </w:rPr>
-              <w:t>ካሪየር</w:t>
-            </w:r>
-          </w:p>
-        </w:tc>
-        <w:tc>
-          <w:tcPr>
-            <w:tcW w:w="0" w:type="auto"/>
-            <w:tcBorders>
-              <w:top w:val="single" w:sz="4" w:space="0" w:color="000000"/>
-              <w:left w:val="single" w:sz="4" w:space="0" w:color="auto"/>
-              <w:bottom w:val="single" w:sz="4" w:space="0" w:color="000000"/>
-              <w:right w:val="single" w:sz="4" w:space="0" w:color="000000"/>
-            </w:tcBorders>
-            <w:vAlign w:val="bottom"/>
-          </w:tcPr>
-          <w:p>
-            <w:pPr>
-              <w:spacing w:after="0" w:line="240" w:lineRule="auto"/>
-              <w:jc w:val="center"/>
-              <w:rPr>
-                <w:rFonts w:ascii="Power Geez Unicode1" w:eastAsia="Times New Roman" w:hAnsi="Power Geez Unicode1"/>
-                <w:sz w:val="20"/>
-                <w:szCs w:val="20"/>
-              </w:rPr>
-            </w:pPr>
-          </w:p>
-        </w:tc>
-      </w:tr>
-      <w:tr>
-        <w:trPr>
-          <w:trHeight w:val="50"/>
-          <w:jc w:val="center"/>
-        </w:trPr>
-        <w:tc>
-          <w:tcPr>
-            <w:tcW w:w="0" w:type="auto"/>
-            <w:tcBorders>
-              <w:top w:val="single" w:sz="4" w:space="0" w:color="000000"/>
-              <w:left w:val="single" w:sz="4" w:space="0" w:color="000000"/>
-              <w:bottom w:val="single" w:sz="4" w:space="0" w:color="000000"/>
-              <w:right w:val="single" w:sz="4" w:space="0" w:color="000000"/>
-            </w:tcBorders>
-            <w:vAlign w:val="bottom"/>
-          </w:tcPr>
-          <w:p>
-            <w:pPr>
-              <w:jc w:val="right"/>
-              <w:rPr>
-                <w:rFonts w:cs="Calibri"/>
-                <w:color w:val="000000"/>
-                <w:sz w:val="24"/>
-                <w:szCs w:val="24"/>
-              </w:rPr>
-            </w:pPr>
-            <w:r>
-              <w:rPr>
-                <w:rFonts w:cs="Calibri"/>
-                <w:color w:val="000000"/>
-              </w:rPr>
-              <w:t>9</w:t>
-            </w:r>
-          </w:p>
-        </w:tc>
-        <w:tc>
-          <w:tcPr>
-            <w:tcW w:w="0" w:type="auto"/>
-            <w:tcBorders>
-              <w:top w:val="single" w:sz="4" w:space="0" w:color="000000"/>
-              <w:left w:val="single" w:sz="4" w:space="0" w:color="000000"/>
-              <w:bottom w:val="single" w:sz="4" w:space="0" w:color="000000"/>
-              <w:right w:val="single" w:sz="4" w:space="0" w:color="000000"/>
-            </w:tcBorders>
-            <w:vAlign w:val="center"/>
-          </w:tcPr>
-          <w:p>
-            <w:pPr>
-              <w:jc w:val="both"/>
-              <w:rPr>
-                <w:rFonts w:ascii="Power Geez Unicode1" w:hAnsi="Power Geez Unicode1" w:cs="Calibri"/>
-                <w:color w:val="000000"/>
-                <w:sz w:val="24"/>
-                <w:szCs w:val="24"/>
-              </w:rPr>
-            </w:pPr>
-            <w:r>
-              <w:rPr>
-                <w:rFonts w:ascii="Power Geez Unicode1" w:hAnsi="Power Geez Unicode1" w:cs="Calibri"/>
-                <w:color w:val="000000"/>
-              </w:rPr>
-              <w:t>መኮነን ደመቀ</w:t>
-            </w:r>
-          </w:p>
-        </w:tc>
-        <w:tc>
-          <w:tcPr>
-            <w:tcW w:w="0" w:type="auto"/>
-            <w:tcBorders>
-              <w:top w:val="single" w:sz="4" w:space="0" w:color="000000"/>
-              <w:left w:val="single" w:sz="4" w:space="0" w:color="000000"/>
-              <w:bottom w:val="single" w:sz="4" w:space="0" w:color="000000"/>
-              <w:right w:val="single" w:sz="4" w:space="0" w:color="000000"/>
-            </w:tcBorders>
-            <w:shd w:val="clear" w:color="auto" w:fill="FFFFFF" w:themeFill="background1"/>
-            <w:vAlign w:val="center"/>
-          </w:tcPr>
-          <w:p>
-            <w:pPr>
-              <w:jc w:val="both"/>
-              <w:rPr>
-                <w:rFonts w:ascii="Power Geez Unicode1" w:hAnsi="Power Geez Unicode1" w:cs="Calibri"/>
-                <w:color w:val="000000"/>
-                <w:sz w:val="24"/>
-                <w:szCs w:val="24"/>
-              </w:rPr>
-            </w:pPr>
-            <w:r>
-              <w:rPr>
-                <w:rFonts w:ascii="Power Geez Unicode1" w:hAnsi="Power Geez Unicode1" w:cs="Calibri"/>
-                <w:color w:val="000000"/>
-              </w:rPr>
-              <w:t>HO</w:t>
-            </w:r>
-          </w:p>
-        </w:tc>
-        <w:tc>
-          <w:tcPr>
-            <w:tcW w:w="0" w:type="auto"/>
-            <w:tcBorders>
-              <w:top w:val="single" w:sz="4" w:space="0" w:color="000000"/>
-              <w:left w:val="single" w:sz="4" w:space="0" w:color="000000"/>
-              <w:bottom w:val="single" w:sz="4" w:space="0" w:color="000000"/>
-              <w:right w:val="single" w:sz="4" w:space="0" w:color="000000"/>
-            </w:tcBorders>
-            <w:vAlign w:val="center"/>
-          </w:tcPr>
-          <w:p>
-            <w:pPr>
-              <w:spacing w:after="0" w:line="240" w:lineRule="auto"/>
-              <w:rPr>
-                <w:rFonts w:ascii="Nyala" w:eastAsia="Times New Roman" w:hAnsi="Nyala"/>
-                <w:sz w:val="20"/>
-                <w:szCs w:val="20"/>
-                <w:lang w:val="am-ET"/>
-              </w:rPr>
-            </w:pPr>
-            <w:r>
-              <w:rPr>
-                <w:rFonts w:ascii="Power Geez Unicode1" w:eastAsia="Times New Roman" w:hAnsi="Power Geez Unicode1"/>
-                <w:sz w:val="20"/>
-                <w:szCs w:val="20"/>
-              </w:rPr>
-              <w:t>13.6</w:t>
-            </w:r>
-            <w:r>
-              <w:rPr>
-                <w:rFonts w:ascii="Power Geez Unicode1" w:eastAsia="Times New Roman" w:hAnsi="Power Geez Unicode1"/>
-                <w:sz w:val="20"/>
-                <w:szCs w:val="20"/>
-              </w:rPr>
-              <w:t>/አዲ-አ/ሆሰ--</w:t>
-            </w:r>
-          </w:p>
-        </w:tc>
-        <w:tc>
-          <w:tcPr>
-            <w:tcW w:w="0" w:type="auto"/>
-            <w:tcBorders>
-              <w:top w:val="single" w:sz="4" w:space="0" w:color="000000"/>
-              <w:left w:val="single" w:sz="4" w:space="0" w:color="000000"/>
-              <w:bottom w:val="single" w:sz="4" w:space="0" w:color="000000"/>
-              <w:right w:val="single" w:sz="4" w:space="0" w:color="auto"/>
-            </w:tcBorders>
-            <w:vAlign w:val="center"/>
-          </w:tcPr>
-          <w:p>
-            <w:pPr>
-              <w:jc w:val="both"/>
-              <w:rPr>
-                <w:rFonts w:ascii="Power Geez Unicode1" w:hAnsi="Power Geez Unicode1" w:cs="Calibri"/>
-                <w:color w:val="000000"/>
-                <w:sz w:val="24"/>
-                <w:szCs w:val="24"/>
-              </w:rPr>
-            </w:pPr>
-            <w:r>
-              <w:rPr>
-                <w:rFonts w:ascii="Power Geez Unicode1" w:hAnsi="Power Geez Unicode1" w:cs="Calibri"/>
-                <w:color w:val="000000"/>
-              </w:rPr>
-              <w:t>ካሪየር</w:t>
-            </w:r>
-          </w:p>
-        </w:tc>
-        <w:tc>
-          <w:tcPr>
-            <w:tcW w:w="0" w:type="auto"/>
-            <w:tcBorders>
-              <w:top w:val="single" w:sz="4" w:space="0" w:color="000000"/>
-              <w:left w:val="single" w:sz="4" w:space="0" w:color="auto"/>
-              <w:bottom w:val="single" w:sz="4" w:space="0" w:color="000000"/>
-              <w:right w:val="single" w:sz="4" w:space="0" w:color="000000"/>
-            </w:tcBorders>
-            <w:vAlign w:val="bottom"/>
-          </w:tcPr>
-          <w:p>
-            <w:pPr>
-              <w:spacing w:after="0" w:line="240" w:lineRule="auto"/>
-              <w:jc w:val="center"/>
-              <w:rPr>
-                <w:rFonts w:ascii="Power Geez Unicode1" w:eastAsia="Times New Roman" w:hAnsi="Power Geez Unicode1"/>
-                <w:sz w:val="20"/>
-                <w:szCs w:val="20"/>
-              </w:rPr>
-            </w:pPr>
-          </w:p>
-        </w:tc>
-      </w:tr>
-      <w:bookmarkEnd w:id="0"/>
     </w:tbl>
     <w:p>
       <w:pPr>
@@ -2582,14 +2047,14 @@
             </wp:anchor>
           </w:drawing>
         </mc:Choice>
-        <mc:Fallback xmlns:cx="http://schemas.microsoft.com/office/drawing/2014/chartex" xmlns:w15="http://schemas.microsoft.com/office/word/2012/wordml" xmlns:w16se="http://schemas.microsoft.com/office/word/2015/wordml/symex">
+        <mc:Fallback>
           <w:pict>
-            <v:shapetype w14:anchorId="6A6873EF" id="_x0000_t202" coordsize="21600,21600" o:spt="202" path="m,l,21600r21600,l21600,xe">
+            <v:shapetype id="_x0000_t202" coordsize="21600,21600" o:spt="202" path="m,l,21600r21600,l21600,xe">
               <v:stroke joinstyle="miter"/>
               <v:path gradientshapeok="t" o:connecttype="rect"/>
             </v:shapetype>
             <v:shape id="Text Box 3" o:spid="_x0000_s1026" type="#_x0000_t202" style="position:absolute;left:0;text-align:left;margin-left:398.6pt;margin-top:57.55pt;width:128.6pt;height:50.15pt;rotation:878115fd;z-index:251660288;visibility:visible;mso-wrap-style:square;mso-width-percent:0;mso-height-percent:0;mso-wrap-distance-left:9pt;mso-wrap-distance-top:0;mso-wrap-distance-right:9pt;mso-wrap-distance-bottom:0;mso-position-horizontal:absolute;mso-position-horizontal-relative:text;mso-position-vertical:absolute;mso-position-vertical-relative:text;mso-width-percent:0;mso-height-percent:0;mso-width-relative:page;mso-height-relative:page;v-text-anchor:top" o:gfxdata="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" filled="f" stroked="f">
-              <o:lock v:ext="edit" shapetype="t"/>
+              <o:lock v:ext="edit" text="t" shapetype="t"/>
               <v:textbox style="mso-fit-shape-to-text:t">
                 <w:txbxContent>
                   <w:p>
@@ -3206,10 +2671,10 @@
             </wp:anchor>
           </w:drawing>
         </mc:Choice>
-        <mc:Fallback xmlns:cx="http://schemas.microsoft.com/office/drawing/2014/chartex" xmlns:w15="http://schemas.microsoft.com/office/word/2012/wordml" xmlns:w16se="http://schemas.microsoft.com/office/word/2015/wordml/symex">
+        <mc:Fallback>
           <w:pict>
-            <v:shape w14:anchorId="2CC263DE" id="Text Box 1" o:spid="_x0000_s1027" type="#_x0000_t202" style="position:absolute;left:0;text-align:left;margin-left:139.2pt;margin-top:57.55pt;width:127.55pt;height:50.15pt;rotation:893788fd;z-index:251659264;visibility:visible;mso-wrap-style:square;mso-width-percent:0;mso-height-percent:0;mso-wrap-distance-left:9pt;mso-wrap-distance-top:0;mso-wrap-distance-right:9pt;mso-wrap-distance-bottom:0;mso-position-horizontal:absolute;mso-position-horizontal-relative:text;mso-position-vertical:absolute;mso-position-vertical-relative:text;mso-width-percent:0;mso-height-percent:0;mso-width-relative:page;mso-height-relative:page;v-text-anchor:top" o:gfxdata="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" filled="f" stroked="f">
-              <o:lock v:ext="edit" shapetype="t"/>
+            <v:shape id="Text Box 1" o:spid="_x0000_s1027" type="#_x0000_t202" style="position:absolute;left:0;text-align:left;margin-left:139.2pt;margin-top:57.55pt;width:127.55pt;height:50.15pt;rotation:893788fd;z-index:251659264;visibility:visible;mso-wrap-style:square;mso-width-percent:0;mso-height-percent:0;mso-wrap-distance-left:9pt;mso-wrap-distance-top:0;mso-wrap-distance-right:9pt;mso-wrap-distance-bottom:0;mso-position-horizontal:absolute;mso-position-horizontal-relative:text;mso-position-vertical:absolute;mso-position-vertical-relative:text;mso-width-percent:0;mso-height-percent:0;mso-width-relative:page;mso-height-relative:page;v-text-anchor:top" o:gfxdata="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" filled="f" stroked="f">
+              <o:lock v:ext="edit" text="t" shapetype="t"/>
               <v:textbox style="mso-fit-shape-to-text:t">
                 <w:txbxContent>
                   <w:p>

</xml_diff>